<commit_message>
Labor Contract: uniform 11pt font, aligned numbering, two-column signatures
- All text uniformly 11pt (22 half-points)
- Removed first-line indent for aligned numbering
- Two-column signature table (IŞ BERIJI / IŞGÄR)
- Selective bold in intro: Person_FullName, Position_PositionTm
</commit_message>
<xml_diff>
--- a/Visa2026.Module/Resources/App_Labor_Contract_Item.docx
+++ b/Visa2026.Module/Resources/App_Labor_Contract_Item.docx
@@ -36,7 +36,7 @@
       <w:r>
         <w:rPr>
           <w:rFonts w:ascii="Times New Roman" w:hAnsi="Times New Roman"/>
-          <w:sz w:val="20"/>
+          <w:sz w:val="22"/>
           <w:b/>
         </w:rPr>
         <w:t xml:space="preserve">Aşgabat şäheri</w:t>
@@ -131,7 +131,6 @@
     <w:p>
       <w:pPr>
         <w:jc w:val="left"/>
-        <w:ind w:firstLine="360"/>
         <w:spacing w:after="30"/>
       </w:pPr>
       <w:r>
@@ -189,7 +188,6 @@
     <w:p>
       <w:pPr>
         <w:jc w:val="left"/>
-        <w:ind w:firstLine="360"/>
         <w:spacing w:after="30"/>
       </w:pPr>
       <w:r>
@@ -257,7 +255,6 @@
     <w:p>
       <w:pPr>
         <w:jc w:val="left"/>
-        <w:ind w:firstLine="360"/>
         <w:spacing w:after="30"/>
       </w:pPr>
       <w:r>
@@ -306,7 +303,7 @@
       <w:r>
         <w:rPr>
           <w:rFonts w:ascii="Times New Roman" w:hAnsi="Times New Roman"/>
-          <w:sz w:val="20"/>
+          <w:sz w:val="22"/>
           <w:b/>
         </w:rPr>
         <w:t xml:space="preserve">4. Zähmet şertnamasynyň ýatyrylmagy</w:t>
@@ -315,7 +312,6 @@
     <w:p>
       <w:pPr>
         <w:jc w:val="left"/>
-        <w:ind w:firstLine="360"/>
         <w:spacing w:after="20"/>
       </w:pPr>
       <w:r>
@@ -455,7 +451,7 @@
       <w:r>
         <w:rPr>
           <w:rFonts w:ascii="Times New Roman" w:hAnsi="Times New Roman"/>
-          <w:sz w:val="20"/>
+          <w:sz w:val="22"/>
           <w:b/>
         </w:rPr>
         <w:t xml:space="preserve">6. Türkmenistanyň döwletinde alýan aýlyk zähmet haky</w:t>

</xml_diff>